<commit_message>
Update Documentation.docx with revised version
</commit_message>
<xml_diff>
--- a/Documentation.docx
+++ b/Documentation.docx
@@ -137,12 +137,6 @@
         <w:gridCol w:w="4000"/>
       </w:tblGrid>
       <w:tr>
-        <w:tblPrEx>
-          <w:tblCellMar>
-            <w:top w:w="0" w:type="dxa"/>
-            <w:bottom w:w="0" w:type="dxa"/>
-          </w:tblCellMar>
-        </w:tblPrEx>
         <w:tc>
           <w:tcPr>
             <w:tcW w:w="3200" w:type="dxa"/>
@@ -205,12 +199,6 @@
         </w:tc>
       </w:tr>
       <w:tr>
-        <w:tblPrEx>
-          <w:tblCellMar>
-            <w:top w:w="0" w:type="dxa"/>
-            <w:bottom w:w="0" w:type="dxa"/>
-          </w:tblCellMar>
-        </w:tblPrEx>
         <w:tc>
           <w:tcPr>
             <w:tcW w:w="3200" w:type="dxa"/>
@@ -232,16 +220,7 @@
                 <w:sz w:val="22"/>
                 <w:szCs w:val="22"/>
               </w:rPr>
-              <w:t>Lead Development Associate</w:t>
-            </w:r>
-            <w:r>
-              <w:rPr>
-                <w:rFonts w:ascii="Arial" w:eastAsia="Arial" w:hAnsi="Arial" w:cs="Arial"/>
-                <w:color w:val="AAAAAA"/>
-                <w:sz w:val="22"/>
-                <w:szCs w:val="22"/>
-              </w:rPr>
-              <w:t>:</w:t>
+              <w:t>Lead Development Associate:</w:t>
             </w:r>
           </w:p>
         </w:tc>
@@ -293,12 +272,6 @@
         </w:tc>
       </w:tr>
       <w:tr>
-        <w:tblPrEx>
-          <w:tblCellMar>
-            <w:top w:w="0" w:type="dxa"/>
-            <w:bottom w:w="0" w:type="dxa"/>
-          </w:tblCellMar>
-        </w:tblPrEx>
         <w:tc>
           <w:tcPr>
             <w:tcW w:w="3200" w:type="dxa"/>
@@ -320,16 +293,7 @@
                 <w:sz w:val="22"/>
                 <w:szCs w:val="22"/>
               </w:rPr>
-              <w:t>Idea Originator / Contributor</w:t>
-            </w:r>
-            <w:r>
-              <w:rPr>
-                <w:rFonts w:ascii="Arial" w:eastAsia="Arial" w:hAnsi="Arial" w:cs="Arial"/>
-                <w:color w:val="AAAAAA"/>
-                <w:sz w:val="22"/>
-                <w:szCs w:val="22"/>
-              </w:rPr>
-              <w:t>:</w:t>
+              <w:t>Idea Originator / Contributor:</w:t>
             </w:r>
           </w:p>
         </w:tc>
@@ -1934,10 +1898,7 @@
         <w:pStyle w:val="Heading2"/>
       </w:pPr>
       <w:r>
-        <w:t>2</w:t>
-      </w:r>
-      <w:r>
-        <w:t>.1  Comparison of Related Works</w:t>
+        <w:t>2.1  Comparison of Related Works</w:t>
       </w:r>
     </w:p>
     <w:p>
@@ -1970,12 +1931,6 @@
         <w:gridCol w:w="3091"/>
       </w:tblGrid>
       <w:tr>
-        <w:tblPrEx>
-          <w:tblCellMar>
-            <w:top w:w="0" w:type="dxa"/>
-            <w:bottom w:w="0" w:type="dxa"/>
-          </w:tblCellMar>
-        </w:tblPrEx>
         <w:trPr>
           <w:tblHeader/>
         </w:trPr>
@@ -2151,12 +2106,6 @@
         </w:tc>
       </w:tr>
       <w:tr>
-        <w:tblPrEx>
-          <w:tblCellMar>
-            <w:top w:w="0" w:type="dxa"/>
-            <w:bottom w:w="0" w:type="dxa"/>
-          </w:tblCellMar>
-        </w:tblPrEx>
         <w:tc>
           <w:tcPr>
             <w:tcW w:w="2200" w:type="dxa"/>
@@ -2314,12 +2263,6 @@
         </w:tc>
       </w:tr>
       <w:tr>
-        <w:tblPrEx>
-          <w:tblCellMar>
-            <w:top w:w="0" w:type="dxa"/>
-            <w:bottom w:w="0" w:type="dxa"/>
-          </w:tblCellMar>
-        </w:tblPrEx>
         <w:tc>
           <w:tcPr>
             <w:tcW w:w="2200" w:type="dxa"/>
@@ -2477,12 +2420,6 @@
         </w:tc>
       </w:tr>
       <w:tr>
-        <w:tblPrEx>
-          <w:tblCellMar>
-            <w:top w:w="0" w:type="dxa"/>
-            <w:bottom w:w="0" w:type="dxa"/>
-          </w:tblCellMar>
-        </w:tblPrEx>
         <w:tc>
           <w:tcPr>
             <w:tcW w:w="2200" w:type="dxa"/>
@@ -2640,12 +2577,6 @@
         </w:tc>
       </w:tr>
       <w:tr>
-        <w:tblPrEx>
-          <w:tblCellMar>
-            <w:top w:w="0" w:type="dxa"/>
-            <w:bottom w:w="0" w:type="dxa"/>
-          </w:tblCellMar>
-        </w:tblPrEx>
         <w:tc>
           <w:tcPr>
             <w:tcW w:w="2200" w:type="dxa"/>
@@ -2803,12 +2734,6 @@
         </w:tc>
       </w:tr>
       <w:tr>
-        <w:tblPrEx>
-          <w:tblCellMar>
-            <w:top w:w="0" w:type="dxa"/>
-            <w:bottom w:w="0" w:type="dxa"/>
-          </w:tblCellMar>
-        </w:tblPrEx>
         <w:tc>
           <w:tcPr>
             <w:tcW w:w="2200" w:type="dxa"/>
@@ -2966,12 +2891,6 @@
         </w:tc>
       </w:tr>
       <w:tr>
-        <w:tblPrEx>
-          <w:tblCellMar>
-            <w:top w:w="0" w:type="dxa"/>
-            <w:bottom w:w="0" w:type="dxa"/>
-          </w:tblCellMar>
-        </w:tblPrEx>
         <w:tc>
           <w:tcPr>
             <w:tcW w:w="2200" w:type="dxa"/>
@@ -3129,12 +3048,6 @@
         </w:tc>
       </w:tr>
       <w:tr>
-        <w:tblPrEx>
-          <w:tblCellMar>
-            <w:top w:w="0" w:type="dxa"/>
-            <w:bottom w:w="0" w:type="dxa"/>
-          </w:tblCellMar>
-        </w:tblPrEx>
         <w:tc>
           <w:tcPr>
             <w:tcW w:w="2200" w:type="dxa"/>
@@ -3318,10 +3231,7 @@
         <w:pStyle w:val="Heading2"/>
       </w:pPr>
       <w:r>
-        <w:t>2</w:t>
-      </w:r>
-      <w:r>
-        <w:t>.2  Research Gap</w:t>
+        <w:t>2.2  Research Gap</w:t>
       </w:r>
     </w:p>
     <w:p>
@@ -3423,10 +3333,7 @@
         <w:pStyle w:val="Heading2"/>
       </w:pPr>
       <w:r>
-        <w:t>2</w:t>
-      </w:r>
-      <w:r>
-        <w:t>.3  Project Feasibility Study</w:t>
+        <w:t>2.3  Project Feasibility Study</w:t>
       </w:r>
     </w:p>
     <w:p>
@@ -3434,10 +3341,7 @@
         <w:pStyle w:val="Heading3"/>
       </w:pPr>
       <w:r>
-        <w:t>2</w:t>
-      </w:r>
-      <w:r>
-        <w:t>.3.1  Operational Feasibility</w:t>
+        <w:t>2.3.1  Operational Feasibility</w:t>
       </w:r>
     </w:p>
     <w:p>
@@ -3471,10 +3375,7 @@
         <w:pStyle w:val="Heading3"/>
       </w:pPr>
       <w:r>
-        <w:t>2</w:t>
-      </w:r>
-      <w:r>
-        <w:t>.3.2  Technical Feasibility</w:t>
+        <w:t>2.3.2  Technical Feasibility</w:t>
       </w:r>
     </w:p>
     <w:p>
@@ -3535,10 +3436,7 @@
         <w:pStyle w:val="Heading3"/>
       </w:pPr>
       <w:r>
-        <w:t>2</w:t>
-      </w:r>
-      <w:r>
-        <w:t>.3.3  Economic Feasibility</w:t>
+        <w:t>2.3.3  Economic Feasibility</w:t>
       </w:r>
     </w:p>
     <w:p>
@@ -3559,10 +3457,7 @@
         <w:pStyle w:val="Heading2"/>
       </w:pPr>
       <w:r>
-        <w:t>2</w:t>
-      </w:r>
-      <w:r>
-        <w:t>.4  Detailed Module Description</w:t>
+        <w:t>2.4  Detailed Module Description</w:t>
       </w:r>
     </w:p>
     <w:p>
@@ -3570,10 +3465,7 @@
         <w:pStyle w:val="Heading3"/>
       </w:pPr>
       <w:r>
-        <w:t>2</w:t>
-      </w:r>
-      <w:r>
-        <w:t>.4.1  Data Acquisition</w:t>
+        <w:t>2.4.1  Data Acquisition</w:t>
       </w:r>
     </w:p>
     <w:p>
@@ -3636,12 +3528,6 @@
         <w:gridCol w:w="9360"/>
       </w:tblGrid>
       <w:tr>
-        <w:tblPrEx>
-          <w:tblCellMar>
-            <w:top w:w="0" w:type="dxa"/>
-            <w:bottom w:w="0" w:type="dxa"/>
-          </w:tblCellMar>
-        </w:tblPrEx>
         <w:tc>
           <w:tcPr>
             <w:tcW w:w="9360" w:type="dxa"/>
@@ -3741,10 +3627,7 @@
         <w:pStyle w:val="Heading3"/>
       </w:pPr>
       <w:r>
-        <w:t>2</w:t>
-      </w:r>
-      <w:r>
-        <w:t>.4.2  Data Pre-processing and Feature Extraction</w:t>
+        <w:t>2.4.2  Data Pre-processing and Feature Extraction</w:t>
       </w:r>
     </w:p>
     <w:p>
@@ -3874,12 +3757,6 @@
         <w:gridCol w:w="9360"/>
       </w:tblGrid>
       <w:tr>
-        <w:tblPrEx>
-          <w:tblCellMar>
-            <w:top w:w="0" w:type="dxa"/>
-            <w:bottom w:w="0" w:type="dxa"/>
-          </w:tblCellMar>
-        </w:tblPrEx>
         <w:tc>
           <w:tcPr>
             <w:tcW w:w="9360" w:type="dxa"/>
@@ -3996,12 +3873,6 @@
         <w:gridCol w:w="2500"/>
       </w:tblGrid>
       <w:tr>
-        <w:tblPrEx>
-          <w:tblCellMar>
-            <w:top w:w="0" w:type="dxa"/>
-            <w:bottom w:w="0" w:type="dxa"/>
-          </w:tblCellMar>
-        </w:tblPrEx>
         <w:trPr>
           <w:tblHeader/>
         </w:trPr>
@@ -4109,12 +3980,6 @@
         </w:tc>
       </w:tr>
       <w:tr>
-        <w:tblPrEx>
-          <w:tblCellMar>
-            <w:top w:w="0" w:type="dxa"/>
-            <w:bottom w:w="0" w:type="dxa"/>
-          </w:tblCellMar>
-        </w:tblPrEx>
         <w:tc>
           <w:tcPr>
             <w:tcW w:w="2500" w:type="dxa"/>
@@ -4210,12 +4075,6 @@
         </w:tc>
       </w:tr>
       <w:tr>
-        <w:tblPrEx>
-          <w:tblCellMar>
-            <w:top w:w="0" w:type="dxa"/>
-            <w:bottom w:w="0" w:type="dxa"/>
-          </w:tblCellMar>
-        </w:tblPrEx>
         <w:tc>
           <w:tcPr>
             <w:tcW w:w="2500" w:type="dxa"/>
@@ -4311,12 +4170,6 @@
         </w:tc>
       </w:tr>
       <w:tr>
-        <w:tblPrEx>
-          <w:tblCellMar>
-            <w:top w:w="0" w:type="dxa"/>
-            <w:bottom w:w="0" w:type="dxa"/>
-          </w:tblCellMar>
-        </w:tblPrEx>
         <w:tc>
           <w:tcPr>
             <w:tcW w:w="2500" w:type="dxa"/>
@@ -4412,12 +4265,6 @@
         </w:tc>
       </w:tr>
       <w:tr>
-        <w:tblPrEx>
-          <w:tblCellMar>
-            <w:top w:w="0" w:type="dxa"/>
-            <w:bottom w:w="0" w:type="dxa"/>
-          </w:tblCellMar>
-        </w:tblPrEx>
         <w:tc>
           <w:tcPr>
             <w:tcW w:w="2500" w:type="dxa"/>
@@ -4513,12 +4360,6 @@
         </w:tc>
       </w:tr>
       <w:tr>
-        <w:tblPrEx>
-          <w:tblCellMar>
-            <w:top w:w="0" w:type="dxa"/>
-            <w:bottom w:w="0" w:type="dxa"/>
-          </w:tblCellMar>
-        </w:tblPrEx>
         <w:tc>
           <w:tcPr>
             <w:tcW w:w="2500" w:type="dxa"/>
@@ -4614,12 +4455,6 @@
         </w:tc>
       </w:tr>
       <w:tr>
-        <w:tblPrEx>
-          <w:tblCellMar>
-            <w:top w:w="0" w:type="dxa"/>
-            <w:bottom w:w="0" w:type="dxa"/>
-          </w:tblCellMar>
-        </w:tblPrEx>
         <w:tc>
           <w:tcPr>
             <w:tcW w:w="2500" w:type="dxa"/>
@@ -4725,10 +4560,7 @@
         <w:pStyle w:val="Heading3"/>
       </w:pPr>
       <w:r>
-        <w:t>2</w:t>
-      </w:r>
-      <w:r>
-        <w:t>.4.3  Gesture Classification</w:t>
+        <w:t>2.4.3  Gesture Classification</w:t>
       </w:r>
     </w:p>
     <w:p>
@@ -4801,12 +4633,6 @@
         <w:gridCol w:w="2880"/>
       </w:tblGrid>
       <w:tr>
-        <w:tblPrEx>
-          <w:tblCellMar>
-            <w:top w:w="0" w:type="dxa"/>
-            <w:bottom w:w="0" w:type="dxa"/>
-          </w:tblCellMar>
-        </w:tblPrEx>
         <w:trPr>
           <w:tblHeader/>
         </w:trPr>
@@ -4982,12 +4808,6 @@
         </w:tc>
       </w:tr>
       <w:tr>
-        <w:tblPrEx>
-          <w:tblCellMar>
-            <w:top w:w="0" w:type="dxa"/>
-            <w:bottom w:w="0" w:type="dxa"/>
-          </w:tblCellMar>
-        </w:tblPrEx>
         <w:tc>
           <w:tcPr>
             <w:tcW w:w="1560" w:type="dxa"/>
@@ -5145,12 +4965,6 @@
         </w:tc>
       </w:tr>
       <w:tr>
-        <w:tblPrEx>
-          <w:tblCellMar>
-            <w:top w:w="0" w:type="dxa"/>
-            <w:bottom w:w="0" w:type="dxa"/>
-          </w:tblCellMar>
-        </w:tblPrEx>
         <w:tc>
           <w:tcPr>
             <w:tcW w:w="1560" w:type="dxa"/>
@@ -5309,12 +5123,6 @@
         </w:tc>
       </w:tr>
       <w:tr>
-        <w:tblPrEx>
-          <w:tblCellMar>
-            <w:top w:w="0" w:type="dxa"/>
-            <w:bottom w:w="0" w:type="dxa"/>
-          </w:tblCellMar>
-        </w:tblPrEx>
         <w:tc>
           <w:tcPr>
             <w:tcW w:w="1560" w:type="dxa"/>
@@ -5472,12 +5280,6 @@
         </w:tc>
       </w:tr>
       <w:tr>
-        <w:tblPrEx>
-          <w:tblCellMar>
-            <w:top w:w="0" w:type="dxa"/>
-            <w:bottom w:w="0" w:type="dxa"/>
-          </w:tblCellMar>
-        </w:tblPrEx>
         <w:tc>
           <w:tcPr>
             <w:tcW w:w="1560" w:type="dxa"/>
@@ -5635,12 +5437,6 @@
         </w:tc>
       </w:tr>
       <w:tr>
-        <w:tblPrEx>
-          <w:tblCellMar>
-            <w:top w:w="0" w:type="dxa"/>
-            <w:bottom w:w="0" w:type="dxa"/>
-          </w:tblCellMar>
-        </w:tblPrEx>
         <w:tc>
           <w:tcPr>
             <w:tcW w:w="1560" w:type="dxa"/>
@@ -6088,12 +5884,6 @@
         <w:gridCol w:w="3360"/>
       </w:tblGrid>
       <w:tr>
-        <w:tblPrEx>
-          <w:tblCellMar>
-            <w:top w:w="0" w:type="dxa"/>
-            <w:bottom w:w="0" w:type="dxa"/>
-          </w:tblCellMar>
-        </w:tblPrEx>
         <w:trPr>
           <w:tblHeader/>
         </w:trPr>
@@ -6235,12 +6025,6 @@
         </w:tc>
       </w:tr>
       <w:tr>
-        <w:tblPrEx>
-          <w:tblCellMar>
-            <w:top w:w="0" w:type="dxa"/>
-            <w:bottom w:w="0" w:type="dxa"/>
-          </w:tblCellMar>
-        </w:tblPrEx>
         <w:tc>
           <w:tcPr>
             <w:tcW w:w="1800" w:type="dxa"/>
@@ -6367,12 +6151,6 @@
         </w:tc>
       </w:tr>
       <w:tr>
-        <w:tblPrEx>
-          <w:tblCellMar>
-            <w:top w:w="0" w:type="dxa"/>
-            <w:bottom w:w="0" w:type="dxa"/>
-          </w:tblCellMar>
-        </w:tblPrEx>
         <w:tc>
           <w:tcPr>
             <w:tcW w:w="1800" w:type="dxa"/>
@@ -6499,12 +6277,6 @@
         </w:tc>
       </w:tr>
       <w:tr>
-        <w:tblPrEx>
-          <w:tblCellMar>
-            <w:top w:w="0" w:type="dxa"/>
-            <w:bottom w:w="0" w:type="dxa"/>
-          </w:tblCellMar>
-        </w:tblPrEx>
         <w:tc>
           <w:tcPr>
             <w:tcW w:w="1800" w:type="dxa"/>
@@ -6631,12 +6403,6 @@
         </w:tc>
       </w:tr>
       <w:tr>
-        <w:tblPrEx>
-          <w:tblCellMar>
-            <w:top w:w="0" w:type="dxa"/>
-            <w:bottom w:w="0" w:type="dxa"/>
-          </w:tblCellMar>
-        </w:tblPrEx>
         <w:tc>
           <w:tcPr>
             <w:tcW w:w="1800" w:type="dxa"/>
@@ -6764,12 +6530,6 @@
         </w:tc>
       </w:tr>
       <w:tr>
-        <w:tblPrEx>
-          <w:tblCellMar>
-            <w:top w:w="0" w:type="dxa"/>
-            <w:bottom w:w="0" w:type="dxa"/>
-          </w:tblCellMar>
-        </w:tblPrEx>
         <w:tc>
           <w:tcPr>
             <w:tcW w:w="1800" w:type="dxa"/>
@@ -6906,10 +6666,7 @@
         <w:pStyle w:val="Heading3"/>
       </w:pPr>
       <w:r>
-        <w:t>2</w:t>
-      </w:r>
-      <w:r>
-        <w:t>.4.4  Text and Speech Translation</w:t>
+        <w:t>2.4.4  Text and Speech Translation</w:t>
       </w:r>
     </w:p>
     <w:p>
@@ -6991,10 +6748,7 @@
         <w:pStyle w:val="Heading2"/>
       </w:pPr>
       <w:r>
-        <w:t>2</w:t>
-      </w:r>
-      <w:r>
-        <w:t>.5  Project SRS (Software Requirements Specification)</w:t>
+        <w:t>2.5  Project SRS (Software Requirements Specification)</w:t>
       </w:r>
     </w:p>
     <w:p>
@@ -7002,10 +6756,7 @@
         <w:pStyle w:val="Heading3"/>
       </w:pPr>
       <w:r>
-        <w:t>2</w:t>
-      </w:r>
-      <w:r>
-        <w:t>.5.1  System Flowchart</w:t>
+        <w:t>2.5.1  System Flowchart</w:t>
       </w:r>
     </w:p>
     <w:p>
@@ -7155,10 +6906,7 @@
         <w:pStyle w:val="Heading3"/>
       </w:pPr>
       <w:r>
-        <w:t>2</w:t>
-      </w:r>
-      <w:r>
-        <w:t>.5.2  Use-Case Diagram</w:t>
+        <w:t>2.5.2  Use-Case Diagram</w:t>
       </w:r>
     </w:p>
     <w:p>
@@ -7203,12 +6951,6 @@
         <w:gridCol w:w="2560"/>
       </w:tblGrid>
       <w:tr>
-        <w:tblPrEx>
-          <w:tblCellMar>
-            <w:top w:w="0" w:type="dxa"/>
-            <w:bottom w:w="0" w:type="dxa"/>
-          </w:tblCellMar>
-        </w:tblPrEx>
         <w:trPr>
           <w:tblHeader/>
         </w:trPr>
@@ -7350,12 +7092,6 @@
         </w:tc>
       </w:tr>
       <w:tr>
-        <w:tblPrEx>
-          <w:tblCellMar>
-            <w:top w:w="0" w:type="dxa"/>
-            <w:bottom w:w="0" w:type="dxa"/>
-          </w:tblCellMar>
-        </w:tblPrEx>
         <w:tc>
           <w:tcPr>
             <w:tcW w:w="2000" w:type="dxa"/>
@@ -7482,12 +7218,6 @@
         </w:tc>
       </w:tr>
       <w:tr>
-        <w:tblPrEx>
-          <w:tblCellMar>
-            <w:top w:w="0" w:type="dxa"/>
-            <w:bottom w:w="0" w:type="dxa"/>
-          </w:tblCellMar>
-        </w:tblPrEx>
         <w:tc>
           <w:tcPr>
             <w:tcW w:w="2000" w:type="dxa"/>
@@ -7614,12 +7344,6 @@
         </w:tc>
       </w:tr>
       <w:tr>
-        <w:tblPrEx>
-          <w:tblCellMar>
-            <w:top w:w="0" w:type="dxa"/>
-            <w:bottom w:w="0" w:type="dxa"/>
-          </w:tblCellMar>
-        </w:tblPrEx>
         <w:tc>
           <w:tcPr>
             <w:tcW w:w="2000" w:type="dxa"/>
@@ -7746,12 +7470,6 @@
         </w:tc>
       </w:tr>
       <w:tr>
-        <w:tblPrEx>
-          <w:tblCellMar>
-            <w:top w:w="0" w:type="dxa"/>
-            <w:bottom w:w="0" w:type="dxa"/>
-          </w:tblCellMar>
-        </w:tblPrEx>
         <w:tc>
           <w:tcPr>
             <w:tcW w:w="2000" w:type="dxa"/>
@@ -7878,12 +7596,6 @@
         </w:tc>
       </w:tr>
       <w:tr>
-        <w:tblPrEx>
-          <w:tblCellMar>
-            <w:top w:w="0" w:type="dxa"/>
-            <w:bottom w:w="0" w:type="dxa"/>
-          </w:tblCellMar>
-        </w:tblPrEx>
         <w:tc>
           <w:tcPr>
             <w:tcW w:w="2000" w:type="dxa"/>
@@ -8010,12 +7722,6 @@
         </w:tc>
       </w:tr>
       <w:tr>
-        <w:tblPrEx>
-          <w:tblCellMar>
-            <w:top w:w="0" w:type="dxa"/>
-            <w:bottom w:w="0" w:type="dxa"/>
-          </w:tblCellMar>
-        </w:tblPrEx>
         <w:tc>
           <w:tcPr>
             <w:tcW w:w="2000" w:type="dxa"/>
@@ -8142,12 +7848,6 @@
         </w:tc>
       </w:tr>
       <w:tr>
-        <w:tblPrEx>
-          <w:tblCellMar>
-            <w:top w:w="0" w:type="dxa"/>
-            <w:bottom w:w="0" w:type="dxa"/>
-          </w:tblCellMar>
-        </w:tblPrEx>
         <w:tc>
           <w:tcPr>
             <w:tcW w:w="2000" w:type="dxa"/>
@@ -8274,12 +7974,6 @@
         </w:tc>
       </w:tr>
       <w:tr>
-        <w:tblPrEx>
-          <w:tblCellMar>
-            <w:top w:w="0" w:type="dxa"/>
-            <w:bottom w:w="0" w:type="dxa"/>
-          </w:tblCellMar>
-        </w:tblPrEx>
         <w:tc>
           <w:tcPr>
             <w:tcW w:w="2000" w:type="dxa"/>
@@ -8416,10 +8110,7 @@
         <w:pStyle w:val="Heading3"/>
       </w:pPr>
       <w:r>
-        <w:t>2</w:t>
-      </w:r>
-      <w:r>
-        <w:t>.5.3  Data Flow Diagram</w:t>
+        <w:t>2.5.3  Data Flow Diagram</w:t>
       </w:r>
     </w:p>
     <w:p>
@@ -8494,12 +8185,6 @@
         <w:gridCol w:w="2360"/>
       </w:tblGrid>
       <w:tr>
-        <w:tblPrEx>
-          <w:tblCellMar>
-            <w:top w:w="0" w:type="dxa"/>
-            <w:bottom w:w="0" w:type="dxa"/>
-          </w:tblCellMar>
-        </w:tblPrEx>
         <w:trPr>
           <w:tblHeader/>
         </w:trPr>
@@ -8641,12 +8326,6 @@
         </w:tc>
       </w:tr>
       <w:tr>
-        <w:tblPrEx>
-          <w:tblCellMar>
-            <w:top w:w="0" w:type="dxa"/>
-            <w:bottom w:w="0" w:type="dxa"/>
-          </w:tblCellMar>
-        </w:tblPrEx>
         <w:tc>
           <w:tcPr>
             <w:tcW w:w="2000" w:type="dxa"/>
@@ -8773,12 +8452,6 @@
         </w:tc>
       </w:tr>
       <w:tr>
-        <w:tblPrEx>
-          <w:tblCellMar>
-            <w:top w:w="0" w:type="dxa"/>
-            <w:bottom w:w="0" w:type="dxa"/>
-          </w:tblCellMar>
-        </w:tblPrEx>
         <w:tc>
           <w:tcPr>
             <w:tcW w:w="2000" w:type="dxa"/>
@@ -8905,12 +8578,6 @@
         </w:tc>
       </w:tr>
       <w:tr>
-        <w:tblPrEx>
-          <w:tblCellMar>
-            <w:top w:w="0" w:type="dxa"/>
-            <w:bottom w:w="0" w:type="dxa"/>
-          </w:tblCellMar>
-        </w:tblPrEx>
         <w:tc>
           <w:tcPr>
             <w:tcW w:w="2000" w:type="dxa"/>
@@ -9037,12 +8704,6 @@
         </w:tc>
       </w:tr>
       <w:tr>
-        <w:tblPrEx>
-          <w:tblCellMar>
-            <w:top w:w="0" w:type="dxa"/>
-            <w:bottom w:w="0" w:type="dxa"/>
-          </w:tblCellMar>
-        </w:tblPrEx>
         <w:tc>
           <w:tcPr>
             <w:tcW w:w="2000" w:type="dxa"/>
@@ -9170,12 +8831,6 @@
         </w:tc>
       </w:tr>
       <w:tr>
-        <w:tblPrEx>
-          <w:tblCellMar>
-            <w:top w:w="0" w:type="dxa"/>
-            <w:bottom w:w="0" w:type="dxa"/>
-          </w:tblCellMar>
-        </w:tblPrEx>
         <w:tc>
           <w:tcPr>
             <w:tcW w:w="2000" w:type="dxa"/>
@@ -9302,12 +8957,6 @@
         </w:tc>
       </w:tr>
       <w:tr>
-        <w:tblPrEx>
-          <w:tblCellMar>
-            <w:top w:w="0" w:type="dxa"/>
-            <w:bottom w:w="0" w:type="dxa"/>
-          </w:tblCellMar>
-        </w:tblPrEx>
         <w:tc>
           <w:tcPr>
             <w:tcW w:w="2000" w:type="dxa"/>
@@ -9434,12 +9083,6 @@
         </w:tc>
       </w:tr>
       <w:tr>
-        <w:tblPrEx>
-          <w:tblCellMar>
-            <w:top w:w="0" w:type="dxa"/>
-            <w:bottom w:w="0" w:type="dxa"/>
-          </w:tblCellMar>
-        </w:tblPrEx>
         <w:tc>
           <w:tcPr>
             <w:tcW w:w="2000" w:type="dxa"/>
@@ -9566,12 +9209,6 @@
         </w:tc>
       </w:tr>
       <w:tr>
-        <w:tblPrEx>
-          <w:tblCellMar>
-            <w:top w:w="0" w:type="dxa"/>
-            <w:bottom w:w="0" w:type="dxa"/>
-          </w:tblCellMar>
-        </w:tblPrEx>
         <w:tc>
           <w:tcPr>
             <w:tcW w:w="2000" w:type="dxa"/>
@@ -9708,10 +9345,7 @@
         <w:pStyle w:val="Heading3"/>
       </w:pPr>
       <w:r>
-        <w:t>2</w:t>
-      </w:r>
-      <w:r>
-        <w:t>.5.4  Sequence Diagram</w:t>
+        <w:t>2.5.4  Sequence Diagram</w:t>
       </w:r>
     </w:p>
     <w:p>
@@ -9990,10 +9624,7 @@
         <w:pStyle w:val="Heading2"/>
       </w:pPr>
       <w:r>
-        <w:t>3</w:t>
-      </w:r>
-      <w:r>
-        <w:t>.1  Project Directory Structure</w:t>
+        <w:t>3.1  Project Directory Structure</w:t>
       </w:r>
     </w:p>
     <w:tbl>
@@ -10017,12 +9648,6 @@
         <w:gridCol w:w="9360"/>
       </w:tblGrid>
       <w:tr>
-        <w:tblPrEx>
-          <w:tblCellMar>
-            <w:top w:w="0" w:type="dxa"/>
-            <w:bottom w:w="0" w:type="dxa"/>
-          </w:tblCellMar>
-        </w:tblPrEx>
         <w:tc>
           <w:tcPr>
             <w:tcW w:w="9360" w:type="dxa"/>
@@ -10447,10 +10072,7 @@
       </w:pPr>
       <w:r>
         <w:lastRenderedPageBreak/>
-        <w:t>3</w:t>
-      </w:r>
-      <w:r>
-        <w:t>.2  Core Module Files</w:t>
+        <w:t>3.2  Core Module Files</w:t>
       </w:r>
     </w:p>
     <w:p>
@@ -10458,10 +10080,7 @@
         <w:pStyle w:val="Heading3"/>
       </w:pPr>
       <w:r>
-        <w:t>3</w:t>
-      </w:r>
-      <w:r>
-        <w:t>.2.1  hand_tracker.py</w:t>
+        <w:t>3.2.1  hand_tracker.py</w:t>
       </w:r>
     </w:p>
     <w:p>
@@ -10482,10 +10101,7 @@
         <w:pStyle w:val="Heading3"/>
       </w:pPr>
       <w:r>
-        <w:t>3</w:t>
-      </w:r>
-      <w:r>
-        <w:t>.2.2  gesture_engine.py</w:t>
+        <w:t>3.2.2  gesture_engine.py</w:t>
       </w:r>
     </w:p>
     <w:p>
@@ -10506,10 +10122,7 @@
         <w:pStyle w:val="Heading3"/>
       </w:pPr>
       <w:r>
-        <w:t>3</w:t>
-      </w:r>
-      <w:r>
-        <w:t>.2.3  gesture_manager.py</w:t>
+        <w:t>3.2.3  gesture_manager.py</w:t>
       </w:r>
     </w:p>
     <w:p>
@@ -10530,10 +10143,7 @@
         <w:pStyle w:val="Heading3"/>
       </w:pPr>
       <w:r>
-        <w:t>3</w:t>
-      </w:r>
-      <w:r>
-        <w:t>.2.4  text_buffer.py</w:t>
+        <w:t>3.2.4  text_buffer.py</w:t>
       </w:r>
     </w:p>
     <w:p>
@@ -10554,10 +10164,7 @@
         <w:pStyle w:val="Heading3"/>
       </w:pPr>
       <w:r>
-        <w:t>3</w:t>
-      </w:r>
-      <w:r>
-        <w:t>.2.5  tts_engine.py</w:t>
+        <w:t>3.2.5  tts_engine.py</w:t>
       </w:r>
     </w:p>
     <w:p>
@@ -10585,10 +10192,7 @@
         <w:pStyle w:val="Heading3"/>
       </w:pPr>
       <w:r>
-        <w:t>3</w:t>
-      </w:r>
-      <w:r>
-        <w:t>.2.6  performance_monitor.py</w:t>
+        <w:t>3.2.6  performance_monitor.py</w:t>
       </w:r>
     </w:p>
     <w:p>
@@ -10609,10 +10213,7 @@
         <w:pStyle w:val="Heading2"/>
       </w:pPr>
       <w:r>
-        <w:t>3</w:t>
-      </w:r>
-      <w:r>
-        <w:t>.3  Collector Module Files</w:t>
+        <w:t>3.3  Collector Module Files</w:t>
       </w:r>
     </w:p>
     <w:p>
@@ -10620,10 +10221,7 @@
         <w:pStyle w:val="Heading3"/>
       </w:pPr>
       <w:r>
-        <w:t>3</w:t>
-      </w:r>
-      <w:r>
-        <w:t>.3.1  data_manager.py</w:t>
+        <w:t>3.3.1  data_manager.py</w:t>
       </w:r>
     </w:p>
     <w:p>
@@ -10644,10 +10242,7 @@
         <w:pStyle w:val="Heading3"/>
       </w:pPr>
       <w:r>
-        <w:t>3</w:t>
-      </w:r>
-      <w:r>
-        <w:t>.3.2  screens/menu.py — MenuScreen</w:t>
+        <w:t>3.3.2  screens/menu.py — MenuScreen</w:t>
       </w:r>
     </w:p>
     <w:p>
@@ -10668,10 +10263,7 @@
         <w:pStyle w:val="Heading3"/>
       </w:pPr>
       <w:r>
-        <w:t>3</w:t>
-      </w:r>
-      <w:r>
-        <w:t>.3.3  screens/register.py — RegisterScreen</w:t>
+        <w:t>3.3.3  screens/register.py — RegisterScreen</w:t>
       </w:r>
     </w:p>
     <w:p>
@@ -10693,10 +10285,7 @@
       </w:pPr>
       <w:r>
         <w:lastRenderedPageBreak/>
-        <w:t>3</w:t>
-      </w:r>
-      <w:r>
-        <w:t>.3.4  screens/update.py — UpdateScreen</w:t>
+        <w:t>3.3.4  screens/update.py — UpdateScreen</w:t>
       </w:r>
     </w:p>
     <w:p>
@@ -10717,10 +10306,7 @@
         <w:pStyle w:val="Heading2"/>
       </w:pPr>
       <w:r>
-        <w:t>3</w:t>
-      </w:r>
-      <w:r>
-        <w:t>.4  UI Module Files</w:t>
+        <w:t>3.4  UI Module Files</w:t>
       </w:r>
     </w:p>
     <w:p>
@@ -10728,10 +10314,7 @@
         <w:pStyle w:val="Heading3"/>
       </w:pPr>
       <w:r>
-        <w:t>3</w:t>
-      </w:r>
-      <w:r>
-        <w:t>.4.1  ui/overlay.py — Overlay</w:t>
+        <w:t>3.4.1  ui/overlay.py — Overlay</w:t>
       </w:r>
     </w:p>
     <w:p>
@@ -10752,10 +10335,7 @@
         <w:pStyle w:val="Heading3"/>
       </w:pPr>
       <w:r>
-        <w:t>3</w:t>
-      </w:r>
-      <w:r>
-        <w:t>.4.2  ui/pipeline.py — VideoPipeline</w:t>
+        <w:t>3.4.2  ui/pipeline.py — VideoPipeline</w:t>
       </w:r>
     </w:p>
     <w:p>
@@ -10776,10 +10356,7 @@
         <w:pStyle w:val="Heading2"/>
       </w:pPr>
       <w:r>
-        <w:t>3</w:t>
-      </w:r>
-      <w:r>
-        <w:t>.5  Root-Level Files</w:t>
+        <w:t>3.5  Root-Level Files</w:t>
       </w:r>
     </w:p>
     <w:p>
@@ -10787,10 +10364,7 @@
         <w:pStyle w:val="Heading3"/>
       </w:pPr>
       <w:r>
-        <w:t>3</w:t>
-      </w:r>
-      <w:r>
-        <w:t>.5.1  main.py</w:t>
+        <w:t>3.5.1  main.py</w:t>
       </w:r>
     </w:p>
     <w:p>
@@ -10812,10 +10386,7 @@
       </w:pPr>
       <w:r>
         <w:lastRenderedPageBreak/>
-        <w:t>3</w:t>
-      </w:r>
-      <w:r>
-        <w:t>.5.2  train.py</w:t>
+        <w:t>3.5.2  train.py</w:t>
       </w:r>
     </w:p>
     <w:p>
@@ -10836,10 +10407,7 @@
         <w:pStyle w:val="Heading3"/>
       </w:pPr>
       <w:r>
-        <w:t>3</w:t>
-      </w:r>
-      <w:r>
-        <w:t>.5.3  Configuration Files</w:t>
+        <w:t>3.5.3  Configuration Files</w:t>
       </w:r>
     </w:p>
     <w:p>
@@ -10881,10 +10449,7 @@
         <w:pStyle w:val="Heading2"/>
       </w:pPr>
       <w:r>
-        <w:t>4</w:t>
-      </w:r>
-      <w:r>
-        <w:t>.1  Conclusion</w:t>
+        <w:t>4.1  Conclusion</w:t>
       </w:r>
     </w:p>
     <w:p>
@@ -10936,7 +10501,7 @@
         <w:rPr>
           <w:color w:val="111111"/>
         </w:rPr>
-        <w:t>The project is the product of collaborative effort: the original concept was proposed by Kalya Tamrakar, whose vision of making sign language accessible through technology set the direction for the entire project. The full system architecture, implementation approach, and technical execution was carried out by Neil (Neilhancy Dev), with development support from Cosmica Khadka as Lead Development Associate and Jasmin Karki as Development Associate.</w:t>
+        <w:t>The project is the product of collaborative effort: the original concept was proposed by Kalya Tamrakar, whose vision of making sign language accessible through technology set the direction for the entire project. The full system architecture, implementation approach, and technical execution was carried out by Neil (Neilhancy Dev), with development support from Cosmica Khadka as Lead Development Associate.</w:t>
       </w:r>
     </w:p>
     <w:p>
@@ -10944,10 +10509,7 @@
         <w:pStyle w:val="Heading2"/>
       </w:pPr>
       <w:r>
-        <w:t>4</w:t>
-      </w:r>
-      <w:r>
-        <w:t>.2  Future Work</w:t>
+        <w:t>4.2  Future Work</w:t>
       </w:r>
     </w:p>
     <w:p>
@@ -12219,6 +11781,7 @@
   <w:style w:type="character" w:default="1" w:styleId="DefaultParagraphFont">
     <w:name w:val="Default Paragraph Font"/>
     <w:uiPriority w:val="1"/>
+    <w:semiHidden/>
     <w:unhideWhenUsed/>
   </w:style>
   <w:style w:type="table" w:default="1" w:styleId="TableNormal">

</xml_diff>